<commit_message>
Add GitHub URL to implementation report
</commit_message>
<xml_diff>
--- a/Bug_Tracker_Implementation_Report.docx
+++ b/Bug_Tracker_Implementation_Report.docx
@@ -29,7 +29,7 @@
           <w:i/>
           <w:sz w:val="24"/>
         </w:rPr>
-        <w:t>Implementation report | Word count: 981</w:t>
+        <w:t>Implementation report | Word count: 994</w:t>
       </w:r>
     </w:p>
     <w:p>
@@ -746,21 +746,35 @@
           <w:rFonts w:ascii="Times New Roman" w:hAnsi="Times New Roman"/>
           <w:sz w:val="24"/>
         </w:rPr>
-        <w:t xml:space="preserve">The project now has a public GitHub repository at </w:t>
+        <w:t>The project now has a public GitHub repository:</w:t>
       </w:r>
       <w:r>
-        <w:rPr>
-          <w:rFonts w:ascii="Courier New" w:hAnsi="Courier New"/>
-          <w:sz w:val="21"/>
-        </w:rPr>
-        <w:t>github.com/LanaPogoda/BugTrackerApp</w:t>
+        <w:t xml:space="preserve"> </w:t>
       </w:r>
+      <w:hyperlink r:id="rId10">
+        <w:r>
+          <w:rPr>
+            <w:rFonts w:ascii="Times New Roman" w:hAnsi="Times New Roman"/>
+            <w:sz w:val="24"/>
+            <w:color w:val="0563C1"/>
+            <w:u w:val="single"/>
+          </w:rPr>
+          <w:t>https://github.com/LanaPogoda/BugTrackerApp</w:t>
+        </w:r>
+      </w:hyperlink>
+    </w:p>
+    <w:p>
+      <w:pPr>
+        <w:widowControl/>
+        <w:spacing w:line="480" w:lineRule="auto" w:before="0" w:after="0"/>
+        <w:ind w:firstLine="720"/>
+      </w:pPr>
       <w:r>
         <w:rPr>
           <w:rFonts w:ascii="Times New Roman" w:hAnsi="Times New Roman"/>
           <w:sz w:val="24"/>
         </w:rPr>
-        <w:t xml:space="preserve">. The initial Android app, backend, and report are committed on </w:t>
+        <w:t xml:space="preserve">The initial Android app, backend, and report are committed on </w:t>
       </w:r>
       <w:r>
         <w:rPr>
@@ -788,7 +802,7 @@
           <w:rFonts w:ascii="Times New Roman" w:hAnsi="Times New Roman"/>
           <w:sz w:val="24"/>
         </w:rPr>
-        <w:t xml:space="preserve">. Before submission, the history still needs genuine feature and hotfix branches, merged commits, and a </w:t>
+        <w:t xml:space="preserve">. The report layout change was completed through a feature branch and merged through a pull request. Before submission, the history still needs a genuine hotfix branch and a </w:t>
       </w:r>
       <w:r>
         <w:rPr>
@@ -934,7 +948,7 @@
       <w:r>
         <w:t xml:space="preserve"> </w:t>
       </w:r>
-      <w:hyperlink r:id="rId10">
+      <w:hyperlink r:id="rId11">
         <w:r>
           <w:rPr>
             <w:rFonts w:ascii="Times New Roman" w:hAnsi="Times New Roman"/>
@@ -977,7 +991,7 @@
       <w:r>
         <w:t xml:space="preserve"> </w:t>
       </w:r>
-      <w:hyperlink r:id="rId11">
+      <w:hyperlink r:id="rId12">
         <w:r>
           <w:rPr>
             <w:rFonts w:ascii="Times New Roman" w:hAnsi="Times New Roman"/>
@@ -1020,7 +1034,7 @@
       <w:r>
         <w:t xml:space="preserve"> </w:t>
       </w:r>
-      <w:hyperlink r:id="rId12">
+      <w:hyperlink r:id="rId13">
         <w:r>
           <w:rPr>
             <w:rFonts w:ascii="Times New Roman" w:hAnsi="Times New Roman"/>
@@ -1063,7 +1077,7 @@
       <w:r>
         <w:t xml:space="preserve"> </w:t>
       </w:r>
-      <w:hyperlink r:id="rId13">
+      <w:hyperlink r:id="rId14">
         <w:r>
           <w:rPr>
             <w:rFonts w:ascii="Times New Roman" w:hAnsi="Times New Roman"/>
@@ -1121,7 +1135,7 @@
       <w:r>
         <w:t xml:space="preserve"> </w:t>
       </w:r>
-      <w:hyperlink r:id="rId14">
+      <w:hyperlink r:id="rId15">
         <w:r>
           <w:rPr>
             <w:rFonts w:ascii="Times New Roman" w:hAnsi="Times New Roman"/>
@@ -1179,7 +1193,7 @@
       <w:r>
         <w:t xml:space="preserve"> </w:t>
       </w:r>
-      <w:hyperlink r:id="rId15">
+      <w:hyperlink r:id="rId16">
         <w:r>
           <w:rPr>
             <w:rFonts w:ascii="Times New Roman" w:hAnsi="Times New Roman"/>
@@ -1222,7 +1236,7 @@
       <w:r>
         <w:t xml:space="preserve"> </w:t>
       </w:r>
-      <w:hyperlink r:id="rId16">
+      <w:hyperlink r:id="rId17">
         <w:r>
           <w:rPr>
             <w:rFonts w:ascii="Times New Roman" w:hAnsi="Times New Roman"/>
@@ -1265,7 +1279,7 @@
       <w:r>
         <w:t xml:space="preserve"> </w:t>
       </w:r>
-      <w:hyperlink r:id="rId17">
+      <w:hyperlink r:id="rId18">
         <w:r>
           <w:rPr>
             <w:rFonts w:ascii="Times New Roman" w:hAnsi="Times New Roman"/>
@@ -1308,7 +1322,7 @@
       <w:r>
         <w:t xml:space="preserve"> </w:t>
       </w:r>
-      <w:hyperlink r:id="rId18">
+      <w:hyperlink r:id="rId19">
         <w:r>
           <w:rPr>
             <w:rFonts w:ascii="Times New Roman" w:hAnsi="Times New Roman"/>

</xml_diff>